<commit_message>
chore: sync workspace changes
</commit_message>
<xml_diff>
--- a/JS_Resume/job_applications/Equal_Experts_Senior_Data_Engineer/Jubhele_Shange_Equal_Experts_Senior_Data_Engineer.docx
+++ b/JS_Resume/job_applications/Equal_Experts_Senior_Data_Engineer/Jubhele_Shange_Equal_Experts_Senior_Data_Engineer.docx
@@ -1,96 +1,66 @@
 
 <file path=word/document.xml><?xml version="1.0" encoding="utf-8"?>
-<w:document xmlns:a="http://schemas.openxmlformats.org/drawingml/2006/main" xmlns:cdr="http://schemas.openxmlformats.org/drawingml/2006/chartDrawing" xmlns:o="urn:schemas-microsoft-com:office:office" xmlns:pic="http://schemas.openxmlformats.org/drawingml/2006/picture" xmlns:r="http://schemas.openxmlformats.org/officeDocument/2006/relationships" xmlns:v="urn:schemas-microsoft-com:vml" xmlns:ve="http://schemas.openxmlformats.org/markup-compatibility/2006" xmlns:vt="http://schemas.openxmlformats.org/officeDocument/2006/docPropsVTypes" xmlns:w="http://schemas.openxmlformats.org/wordprocessingml/2006/main" xmlns:w10="urn:schemas-microsoft-com:office:word" xmlns:wp="http://schemas.openxmlformats.org/drawingml/2006/wordprocessingDrawing" xmlns:wne="http://schemas.microsoft.com/office/word/2006/wordml">
+<w:document xmlns:wpc="http://schemas.microsoft.com/office/word/2010/wordprocessingCanvas" xmlns:cx="http://schemas.microsoft.com/office/drawing/2014/chartex" xmlns:cx1="http://schemas.microsoft.com/office/drawing/2015/9/8/chartex" xmlns:cx2="http://schemas.microsoft.com/office/drawing/2015/10/21/chartex" xmlns:cx3="http://schemas.microsoft.com/office/drawing/2016/5/9/chartex" xmlns:cx4="http://schemas.microsoft.com/office/drawing/2016/5/10/chartex" xmlns:cx5="http://schemas.microsoft.com/office/drawing/2016/5/11/chartex" xmlns:cx6="http://schemas.microsoft.com/office/drawing/2016/5/12/chartex" xmlns:cx7="http://schemas.microsoft.com/office/drawing/2016/5/13/chartex" xmlns:cx8="http://schemas.microsoft.com/office/drawing/2016/5/14/chartex" xmlns:mc="http://schemas.openxmlformats.org/markup-compatibility/2006" xmlns:aink="http://schemas.microsoft.com/office/drawing/2016/ink" xmlns:am3d="http://schemas.microsoft.com/office/drawing/2017/model3d" xmlns:o="urn:schemas-microsoft-com:office:office" xmlns:oel="http://schemas.microsoft.com/office/2019/extlst" xmlns:r="http://schemas.openxmlformats.org/officeDocument/2006/relationships" xmlns:m="http://schemas.openxmlformats.org/officeDocument/2006/math" xmlns:v="urn:schemas-microsoft-com:vml" xmlns:wp14="http://schemas.microsoft.com/office/word/2010/wordprocessingDrawing" xmlns:wp="http://schemas.openxmlformats.org/drawingml/2006/wordprocessingDrawing" xmlns:w10="urn:schemas-microsoft-com:office:word" xmlns:w="http://schemas.openxmlformats.org/wordprocessingml/2006/main" xmlns:w14="http://schemas.microsoft.com/office/word/2010/wordml" xmlns:w15="http://schemas.microsoft.com/office/word/2012/wordml" xmlns:w16cex="http://schemas.microsoft.com/office/word/2018/wordml/cex" xmlns:w16cid="http://schemas.microsoft.com/office/word/2016/wordml/cid" xmlns:w16="http://schemas.microsoft.com/office/word/2018/wordml" xmlns:w16du="http://schemas.microsoft.com/office/word/2023/wordml/word16du" xmlns:w16sdtdh="http://schemas.microsoft.com/office/word/2020/wordml/sdtdatahash" xmlns:w16sdtfl="http://schemas.microsoft.com/office/word/2024/wordml/sdtformatlock" xmlns:w16se="http://schemas.microsoft.com/office/word/2015/wordml/symex" xmlns:wpg="http://schemas.microsoft.com/office/word/2010/wordprocessingGroup" xmlns:wpi="http://schemas.microsoft.com/office/word/2010/wordprocessingInk" xmlns:wne="http://schemas.microsoft.com/office/word/2006/wordml" xmlns:wps="http://schemas.microsoft.com/office/word/2010/wordprocessingShape" mc:Ignorable="w14 w15 w16se w16cid w16 w16cex w16sdtdh w16sdtfl w16du wp14">
   <w:body>
-    <w:sectPr>
-      <w:pgSz w:w="12240" w:h="15840" w:orient="portrait"/>
-      <w:pgMar w:top="1440" w:right="1800" w:bottom="1440" w:left="1800" w:header="720" w:footer="720" w:gutter="0"/>
-    </w:sectPr>
-    <w:p>
-      <w:pPr>
-        <w:spacing w:lineRule="auto"/>
-      </w:pPr>
-      <w:r>
-        <w:rPr/>
-        <w:t xml:space="preserve"/>
-      </w:r>
-    </w:p>
+    <w:p/>
     <w:p>
       <w:pPr>
         <w:pStyle w:val="Heading1"/>
-        <w:spacing w:lineRule="auto"/>
-      </w:pPr>
-      <w:r>
-        <w:rPr/>
-        <w:t xml:space="preserve">JUBHELE NKULULEKO SHANGE</w:t>
-      </w:r>
-    </w:p>
-    <w:p>
-      <w:pPr>
-        <w:spacing w:lineRule="auto"/>
-      </w:pPr>
+      </w:pPr>
+      <w:r>
+        <w:t>JUBHELE NKULULEKO SHANGE</w:t>
+      </w:r>
+    </w:p>
+    <w:p>
       <w:r>
         <w:rPr>
           <w:b/>
         </w:rPr>
-        <w:t xml:space="preserve">Senior Data Engineer | Azure Data Platforms | Data Governance</w:t>
-      </w:r>
-      <w:r>
-        <w:rPr/>
-        <w:br w:type="textWrapping"/>
-      </w:r>
-      <w:r>
-        <w:rPr/>
+        <w:t>Senior Data Engineer | Azure Data Platforms | Data Governance</w:t>
+      </w:r>
+      <w:r>
+        <w:br/>
         <w:t xml:space="preserve">South Africa | </w:t>
+      </w:r>
+      <w:hyperlink r:id="rId5">
+        <w:r>
+          <w:rPr>
+            <w:rStyle w:val="Hyperlink"/>
+          </w:rPr>
+          <w:t>jubhele@gmail.com</w:t>
+        </w:r>
+      </w:hyperlink>
+      <w:r>
+        <w:t xml:space="preserve"> | </w:t>
       </w:r>
       <w:hyperlink r:id="rId6">
         <w:r>
           <w:rPr>
             <w:rStyle w:val="Hyperlink"/>
           </w:rPr>
-          <w:t xml:space="preserve">jubhele@gmail.com</w:t>
+          <w:t>LinkedIn</w:t>
         </w:r>
       </w:hyperlink>
-      <w:r>
-        <w:rPr/>
-        <w:t xml:space="preserve"> | </w:t>
-      </w:r>
-      <w:hyperlink r:id="rId7">
-        <w:r>
-          <w:rPr>
-            <w:rStyle w:val="Hyperlink"/>
-          </w:rPr>
-          <w:t xml:space="preserve">LinkedIn</w:t>
-        </w:r>
-      </w:hyperlink>
     </w:p>
     <w:p>
       <w:pPr>
         <w:pStyle w:val="Heading2"/>
-        <w:spacing w:lineRule="auto"/>
-      </w:pPr>
-      <w:r>
-        <w:rPr/>
-        <w:t xml:space="preserve">Professional Profile</w:t>
-      </w:r>
-    </w:p>
-    <w:p>
-      <w:pPr>
-        <w:spacing w:lineRule="auto"/>
-      </w:pPr>
-      <w:r>
-        <w:rPr/>
-        <w:t xml:space="preserve">Senior data engineer and consultant with 14+ years across data engineering, business intelligence and database delivery, including banking, insurance, investment, mining and enterprise consulting. Builds and supports production data pipelines, warehouses and analytical models using Azure, SQL and Python, with hands-on experience in data governance, security, quality and regulated delivery. Comfortable partnering with clients, mentoring teams and working remotely across distributed environments.</w:t>
+      </w:pPr>
+      <w:r>
+        <w:t>Professional Profile</w:t>
+      </w:r>
+    </w:p>
+    <w:p>
+      <w:r>
+        <w:t>Senior data engineer and consultant with 14+ years across data engineering, business intelligence and database delivery, including banking, insurance, investment, mining and enterprise consulting. Builds and supports production data pipelines, warehouses and analytical models using Azure, SQL and Python, with hands-on experience in data governance, security, quality and regulated delivery. Comfortable partnering with clients, mentoring teams and working remotely across distributed environments.</w:t>
       </w:r>
     </w:p>
     <w:p>
       <w:pPr>
         <w:pStyle w:val="Heading2"/>
-        <w:spacing w:lineRule="auto"/>
-      </w:pPr>
-      <w:r>
-        <w:rPr/>
-        <w:t xml:space="preserve">Core Capabilities</w:t>
+      </w:pPr>
+      <w:r>
+        <w:t>Core Capabilities</w:t>
       </w:r>
     </w:p>
     <w:p>
@@ -99,16 +69,14 @@
           <w:ilvl w:val="0"/>
           <w:numId w:val="1"/>
         </w:numPr>
-        <w:spacing w:lineRule="auto"/>
       </w:pPr>
       <w:r>
         <w:rPr>
           <w:b/>
         </w:rPr>
-        <w:t xml:space="preserve">Data engineering:</w:t>
-      </w:r>
-      <w:r>
-        <w:rPr/>
+        <w:t>Data engineering:</w:t>
+      </w:r>
+      <w:r>
         <w:t xml:space="preserve"> Azure Synapse, Azure Data Factory, SQL Server, ETL/ELT, stored procedures, data warehouses, dimensional modelling, data quality and reconciliation.</w:t>
       </w:r>
     </w:p>
@@ -118,16 +86,14 @@
           <w:ilvl w:val="0"/>
           <w:numId w:val="1"/>
         </w:numPr>
-        <w:spacing w:lineRule="auto"/>
       </w:pPr>
       <w:r>
         <w:rPr>
           <w:b/>
         </w:rPr>
-        <w:t xml:space="preserve">Programming and analytics:</w:t>
-      </w:r>
-      <w:r>
-        <w:rPr/>
+        <w:t>Programming and analytics:</w:t>
+      </w:r>
+      <w:r>
         <w:t xml:space="preserve"> SQL/T-SQL, Python, Pandas, Power BI, DAX, SSIS, SSRS, SSAS and Git-based delivery.</w:t>
       </w:r>
     </w:p>
@@ -137,16 +103,14 @@
           <w:ilvl w:val="0"/>
           <w:numId w:val="1"/>
         </w:numPr>
-        <w:spacing w:lineRule="auto"/>
       </w:pPr>
       <w:r>
         <w:rPr>
           <w:b/>
         </w:rPr>
-        <w:t xml:space="preserve">Governance and security:</w:t>
-      </w:r>
-      <w:r>
-        <w:rPr/>
+        <w:t>Governance and security:</w:t>
+      </w:r>
+      <w:r>
         <w:t xml:space="preserve"> Microsoft Purview, data classification, lineage, sensitivity labels, DLP, information protection, audit controls and regulated-data handling.</w:t>
       </w:r>
     </w:p>
@@ -156,46 +120,82 @@
           <w:ilvl w:val="0"/>
           <w:numId w:val="1"/>
         </w:numPr>
-        <w:spacing w:lineRule="auto"/>
       </w:pPr>
       <w:r>
         <w:rPr>
           <w:b/>
         </w:rPr>
-        <w:t xml:space="preserve">Consulting delivery:</w:t>
-      </w:r>
-      <w:r>
-        <w:rPr/>
+        <w:t>Consulting delivery:</w:t>
+      </w:r>
+      <w:r>
         <w:t xml:space="preserve"> stakeholder discovery, pragmatic solution design, production support, documentation, mentoring, distributed collaboration and continuous improvement.</w:t>
       </w:r>
     </w:p>
     <w:p>
       <w:pPr>
         <w:pStyle w:val="Heading2"/>
-        <w:spacing w:lineRule="auto"/>
-      </w:pPr>
-      <w:r>
-        <w:rPr/>
-        <w:t xml:space="preserve">Professional Experience</w:t>
+      </w:pPr>
+      <w:r>
+        <w:lastRenderedPageBreak/>
+        <w:t>Recruiter Skills Snapshot (Years of Experience)</w:t>
+      </w:r>
+    </w:p>
+    <w:p>
+      <w:pPr>
+        <w:pStyle w:val="Heading2"/>
+      </w:pPr>
+      <w:r>
+        <w:t>Lead the Data Engineering function: 8+ years.</w:t>
+      </w:r>
+    </w:p>
+    <w:p>
+      <w:pPr>
+        <w:pStyle w:val="Heading2"/>
+      </w:pPr>
+      <w:r>
+        <w:t>Leading as a Senior Engineer: 6+ years.</w:t>
+      </w:r>
+    </w:p>
+    <w:p>
+      <w:pPr>
+        <w:pStyle w:val="Heading2"/>
+      </w:pPr>
+      <w:r>
+        <w:t>Build scalable data pipelines: 10+ years.</w:t>
+      </w:r>
+    </w:p>
+    <w:p>
+      <w:pPr>
+        <w:pStyle w:val="Heading2"/>
+      </w:pPr>
+      <w:r>
+        <w:t>Data Engineering leadership with Spark (PySpark in Azure Synapse): 3+ years.</w:t>
+      </w:r>
+    </w:p>
+    <w:p>
+      <w:pPr>
+        <w:pStyle w:val="Heading2"/>
+      </w:pPr>
+    </w:p>
+    <w:p>
+      <w:pPr>
+        <w:pStyle w:val="Heading2"/>
+      </w:pPr>
+      <w:r>
+        <w:t>Professional Experience</w:t>
       </w:r>
     </w:p>
     <w:p>
       <w:pPr>
         <w:pStyle w:val="Heading3"/>
-        <w:spacing w:lineRule="auto"/>
-      </w:pPr>
-      <w:r>
-        <w:rPr/>
-        <w:t xml:space="preserve">Senior Consultant - Data Governance and Engineering | Sambe Consulting</w:t>
-      </w:r>
-    </w:p>
-    <w:p>
-      <w:pPr>
-        <w:spacing w:lineRule="auto"/>
-      </w:pPr>
-      <w:r>
-        <w:rPr/>
-        <w:t xml:space="preserve">January 2025 - Present</w:t>
+      </w:pPr>
+      <w:r>
+        <w:t>Senior Consultant - Data Governance and Engineering | Sambe Consulting</w:t>
+      </w:r>
+    </w:p>
+    <w:p>
+      <w:r>
+        <w:t>January 2025 - Present</w:t>
       </w:r>
     </w:p>
     <w:p>
@@ -204,11 +204,9 @@
           <w:ilvl w:val="0"/>
           <w:numId w:val="2"/>
         </w:numPr>
-        <w:spacing w:lineRule="auto"/>
-      </w:pPr>
-      <w:r>
-        <w:rPr/>
-        <w:t xml:space="preserve">Lead Microsoft Purview delivery for a banking client, implementing enterprise data classification, sensitivity labels, information-protection controls, DLP policies and audit visibility across Microsoft 365.</w:t>
+      </w:pPr>
+      <w:r>
+        <w:t>Lead Microsoft Purview delivery for a banking client, implementing enterprise data classification, sensitivity labels, information-protection controls, DLP policies and audit visibility across Microsoft 365.</w:t>
       </w:r>
     </w:p>
     <w:p>
@@ -217,11 +215,9 @@
           <w:ilvl w:val="0"/>
           <w:numId w:val="2"/>
         </w:numPr>
-        <w:spacing w:lineRule="auto"/>
-      </w:pPr>
-      <w:r>
-        <w:rPr/>
-        <w:t xml:space="preserve">Engineered SQL analytical delivery packs for AML transaction monitoring and Watch List Filtering remediation on Azure Synapse and SQL Server, with auditable scripts and validation evidence.</w:t>
+      </w:pPr>
+      <w:r>
+        <w:t>Engineered SQL analytical delivery packs for AML transaction monitoring and Watch List Filtering remediation on Azure Synapse and SQL Server, with auditable scripts and validation evidence.</w:t>
       </w:r>
     </w:p>
     <w:p>
@@ -230,11 +226,9 @@
           <w:ilvl w:val="0"/>
           <w:numId w:val="2"/>
         </w:numPr>
-        <w:spacing w:lineRule="auto"/>
-      </w:pPr>
-      <w:r>
-        <w:rPr/>
-        <w:t xml:space="preserve">Built and maintained multi-entity financial ETL pipelines from SAP GL and FMI extracts into SQL staging and warehouse fact models, including multi-currency actuals, flash and budget processing.</w:t>
+      </w:pPr>
+      <w:r>
+        <w:t>Built and maintained multi-entity financial ETL pipelines from SAP GL and FMI extracts into SQL staging and warehouse fact models, including multi-currency actuals, flash and budget processing.</w:t>
       </w:r>
     </w:p>
     <w:p>
@@ -243,11 +237,9 @@
           <w:ilvl w:val="0"/>
           <w:numId w:val="2"/>
         </w:numPr>
-        <w:spacing w:lineRule="auto"/>
-      </w:pPr>
-      <w:r>
-        <w:rPr/>
-        <w:t xml:space="preserve">Delivered Power BI and DAX reporting, reconciliation controls and executive financial views; re-engineered asset depreciation logic into optimised SQL procedures.</w:t>
+      </w:pPr>
+      <w:r>
+        <w:t>Delivered Power BI and DAX reporting, reconciliation controls and executive financial views; re-engineered asset depreciation logic into optimised SQL procedures.</w:t>
       </w:r>
     </w:p>
     <w:p>
@@ -256,30 +248,22 @@
           <w:ilvl w:val="0"/>
           <w:numId w:val="2"/>
         </w:numPr>
-        <w:spacing w:lineRule="auto"/>
-      </w:pPr>
-      <w:r>
-        <w:rPr/>
-        <w:t xml:space="preserve">Designed a Next.js and TypeScript operational portal with REST integrations and multi-tenant data isolation for enterprise security operations.</w:t>
+      </w:pPr>
+      <w:r>
+        <w:t>Designed a Next.js and TypeScript operational portal with REST integrations and multi-tenant data isolation for enterprise security operations.</w:t>
       </w:r>
     </w:p>
     <w:p>
       <w:pPr>
         <w:pStyle w:val="Heading3"/>
-        <w:spacing w:lineRule="auto"/>
-      </w:pPr>
-      <w:r>
-        <w:rPr/>
-        <w:t xml:space="preserve">Senior Data Engineer | The Coca-Cola Company</w:t>
-      </w:r>
-    </w:p>
-    <w:p>
-      <w:pPr>
-        <w:spacing w:lineRule="auto"/>
-      </w:pPr>
-      <w:r>
-        <w:rPr/>
-        <w:t xml:space="preserve">June 2024 - December 2024</w:t>
+      </w:pPr>
+      <w:r>
+        <w:t>Senior Data Engineer | The Coca-Cola Company</w:t>
+      </w:r>
+    </w:p>
+    <w:p>
+      <w:r>
+        <w:t>June 2024 - December 2024</w:t>
       </w:r>
     </w:p>
     <w:p>
@@ -288,11 +272,9 @@
           <w:ilvl w:val="0"/>
           <w:numId w:val="3"/>
         </w:numPr>
-        <w:spacing w:lineRule="auto"/>
-      </w:pPr>
-      <w:r>
-        <w:rPr/>
-        <w:t xml:space="preserve">Developed Azure Synapse ETL/ELT pipelines and integration solutions spanning on-premises and cloud data sources, warehouses and data lakes.</w:t>
+      </w:pPr>
+      <w:r>
+        <w:t>Developed Azure Synapse ETL/ELT pipelines and integration solutions spanning on-premises and cloud data sources, warehouses and data lakes.</w:t>
       </w:r>
     </w:p>
     <w:p>
@@ -301,30 +283,23 @@
           <w:ilvl w:val="0"/>
           <w:numId w:val="3"/>
         </w:numPr>
-        <w:spacing w:lineRule="auto"/>
-      </w:pPr>
-      <w:r>
-        <w:rPr/>
-        <w:t xml:space="preserve">Applied Azure Purview for cataloguing, lineage, classification and access control; improved pipeline performance, data quality and cloud cost efficiency.</w:t>
+      </w:pPr>
+      <w:r>
+        <w:t>Applied Azure Purview for cataloguing, lineage, classification and access control; improved pipeline performance, data quality and cloud cost efficiency.</w:t>
       </w:r>
     </w:p>
     <w:p>
       <w:pPr>
         <w:pStyle w:val="Heading3"/>
-        <w:spacing w:lineRule="auto"/>
-      </w:pPr>
-      <w:r>
-        <w:rPr/>
-        <w:t xml:space="preserve">Data Engineer / BI Developer | Standard Bank</w:t>
-      </w:r>
-    </w:p>
-    <w:p>
-      <w:pPr>
-        <w:spacing w:lineRule="auto"/>
-      </w:pPr>
-      <w:r>
-        <w:rPr/>
-        <w:t xml:space="preserve">March 2024 - June 2024</w:t>
+      </w:pPr>
+      <w:r>
+        <w:lastRenderedPageBreak/>
+        <w:t>Data Engineer / BI Developer | Standard Bank</w:t>
+      </w:r>
+    </w:p>
+    <w:p>
+      <w:r>
+        <w:t>March 2024 - June 2024</w:t>
       </w:r>
     </w:p>
     <w:p>
@@ -333,30 +308,22 @@
           <w:ilvl w:val="0"/>
           <w:numId w:val="4"/>
         </w:numPr>
-        <w:spacing w:lineRule="auto"/>
-      </w:pPr>
-      <w:r>
-        <w:rPr/>
-        <w:t xml:space="preserve">Translated business requirements into data models, ETL processes, data marts and Power BI reporting while maintaining data quality, security and stakeholder support.</w:t>
+      </w:pPr>
+      <w:r>
+        <w:t>Translated business requirements into data models, ETL processes, data marts and Power BI reporting while maintaining data quality, security and stakeholder support.</w:t>
       </w:r>
     </w:p>
     <w:p>
       <w:pPr>
         <w:pStyle w:val="Heading3"/>
-        <w:spacing w:lineRule="auto"/>
-      </w:pPr>
-      <w:r>
-        <w:rPr/>
-        <w:t xml:space="preserve">Senior Data Engineer / BI Developer | Anglo American</w:t>
-      </w:r>
-    </w:p>
-    <w:p>
-      <w:pPr>
-        <w:spacing w:lineRule="auto"/>
-      </w:pPr>
-      <w:r>
-        <w:rPr/>
-        <w:t xml:space="preserve">September 2022 - December 2023</w:t>
+      </w:pPr>
+      <w:r>
+        <w:t>Senior Data Engineer / BI Developer | Anglo American</w:t>
+      </w:r>
+    </w:p>
+    <w:p>
+      <w:r>
+        <w:t>September 2022 - December 2023</w:t>
       </w:r>
     </w:p>
     <w:p>
@@ -365,30 +332,22 @@
           <w:ilvl w:val="0"/>
           <w:numId w:val="5"/>
         </w:numPr>
-        <w:spacing w:lineRule="auto"/>
-      </w:pPr>
-      <w:r>
-        <w:rPr/>
-        <w:t xml:space="preserve">Delivered batch and real-time ingestion, ETL/ELT pipelines and data models across Azure and Snowflake; tested data flows and integrated on-premises and cloud platforms.</w:t>
+      </w:pPr>
+      <w:r>
+        <w:t>Delivered batch and real-time ingestion, ETL/ELT pipelines and data models across Azure and Snowflake; tested data flows and integrated on-premises and cloud platforms.</w:t>
       </w:r>
     </w:p>
     <w:p>
       <w:pPr>
         <w:pStyle w:val="Heading3"/>
-        <w:spacing w:lineRule="auto"/>
-      </w:pPr>
-      <w:r>
-        <w:rPr/>
-        <w:t xml:space="preserve">Senior Data Engineer / BI Developer | Investec</w:t>
-      </w:r>
-    </w:p>
-    <w:p>
-      <w:pPr>
-        <w:spacing w:lineRule="auto"/>
-      </w:pPr>
-      <w:r>
-        <w:rPr/>
-        <w:t xml:space="preserve">August 2019 - July 2022</w:t>
+      </w:pPr>
+      <w:r>
+        <w:t>Senior Data Engineer / BI Developer | Investec</w:t>
+      </w:r>
+    </w:p>
+    <w:p>
+      <w:r>
+        <w:t>August 2019 - July 2022</w:t>
       </w:r>
     </w:p>
     <w:p>
@@ -397,30 +356,22 @@
           <w:ilvl w:val="0"/>
           <w:numId w:val="6"/>
         </w:numPr>
-        <w:spacing w:lineRule="auto"/>
-      </w:pPr>
-      <w:r>
-        <w:rPr/>
-        <w:t xml:space="preserve">Designed and supported production ETL, warehouse models and BI solutions for financial services, optimising SQL structures and partnering with analysts and business stakeholders.</w:t>
+      </w:pPr>
+      <w:r>
+        <w:t>Designed and supported production ETL, warehouse models and BI solutions for financial services, optimising SQL structures and partnering with analysts and business stakeholders.</w:t>
       </w:r>
     </w:p>
     <w:p>
       <w:pPr>
         <w:pStyle w:val="Heading3"/>
-        <w:spacing w:lineRule="auto"/>
-      </w:pPr>
-      <w:r>
-        <w:rPr/>
-        <w:t xml:space="preserve">Data Engineer / BI Developer | Life Healthcare (CyberPro Consulting)</w:t>
-      </w:r>
-    </w:p>
-    <w:p>
-      <w:pPr>
-        <w:spacing w:lineRule="auto"/>
-      </w:pPr>
-      <w:r>
-        <w:rPr/>
-        <w:t xml:space="preserve">May 2018 - July 2019</w:t>
+      </w:pPr>
+      <w:r>
+        <w:t>Data Engineer / BI Developer | Life Healthcare (CyberPro Consulting)</w:t>
+      </w:r>
+    </w:p>
+    <w:p>
+      <w:r>
+        <w:t>May 2018 - July 2019</w:t>
       </w:r>
     </w:p>
     <w:p>
@@ -429,30 +380,22 @@
           <w:ilvl w:val="0"/>
           <w:numId w:val="7"/>
         </w:numPr>
-        <w:spacing w:lineRule="auto"/>
-      </w:pPr>
-      <w:r>
-        <w:rPr/>
-        <w:t xml:space="preserve">Built and tested BI architecture, data processes and executive dashboards; automated reporting and improved data reliability, efficiency and quality.</w:t>
+      </w:pPr>
+      <w:r>
+        <w:t>Built and tested BI architecture, data processes and executive dashboards; automated reporting and improved data reliability, efficiency and quality.</w:t>
       </w:r>
     </w:p>
     <w:p>
       <w:pPr>
         <w:pStyle w:val="Heading3"/>
-        <w:spacing w:lineRule="auto"/>
-      </w:pPr>
-      <w:r>
-        <w:rPr/>
-        <w:t xml:space="preserve">Senior BI Developer | Osiris Trading</w:t>
-      </w:r>
-    </w:p>
-    <w:p>
-      <w:pPr>
-        <w:spacing w:lineRule="auto"/>
-      </w:pPr>
-      <w:r>
-        <w:rPr/>
-        <w:t xml:space="preserve">October 2014 - January 2018</w:t>
+      </w:pPr>
+      <w:r>
+        <w:t>Senior BI Developer | Osiris Trading</w:t>
+      </w:r>
+    </w:p>
+    <w:p>
+      <w:r>
+        <w:t>October 2014 - January 2018</w:t>
       </w:r>
     </w:p>
     <w:p>
@@ -461,30 +404,22 @@
           <w:ilvl w:val="0"/>
           <w:numId w:val="8"/>
         </w:numPr>
-        <w:spacing w:lineRule="auto"/>
-      </w:pPr>
-      <w:r>
-        <w:rPr/>
-        <w:t xml:space="preserve">Designed warehouse models, SSIS integrations, SSRS reporting and analytical solutions for risk and payments; performed QA and mentored junior developers.</w:t>
+      </w:pPr>
+      <w:r>
+        <w:t>Designed warehouse models, SSIS integrations, SSRS reporting and analytical solutions for risk and payments; performed QA and mentored junior developers.</w:t>
       </w:r>
     </w:p>
     <w:p>
       <w:pPr>
         <w:pStyle w:val="Heading3"/>
-        <w:spacing w:lineRule="auto"/>
-      </w:pPr>
-      <w:r>
-        <w:rPr/>
-        <w:t xml:space="preserve">BI Developer | MiWay Insurance</w:t>
-      </w:r>
-    </w:p>
-    <w:p>
-      <w:pPr>
-        <w:spacing w:lineRule="auto"/>
-      </w:pPr>
-      <w:r>
-        <w:rPr/>
-        <w:t xml:space="preserve">May 2012 - September 2014</w:t>
+      </w:pPr>
+      <w:r>
+        <w:t>BI Developer | MiWay Insurance</w:t>
+      </w:r>
+    </w:p>
+    <w:p>
+      <w:r>
+        <w:t>May 2012 - September 2014</w:t>
       </w:r>
     </w:p>
     <w:p>
@@ -493,30 +428,22 @@
           <w:ilvl w:val="0"/>
           <w:numId w:val="9"/>
         </w:numPr>
-        <w:spacing w:lineRule="auto"/>
-      </w:pPr>
-      <w:r>
-        <w:rPr/>
-        <w:t xml:space="preserve">Supported data warehouse design, data extraction and manipulation, incident root-cause analysis, planning reports and Power BI delivery.</w:t>
+      </w:pPr>
+      <w:r>
+        <w:t>Supported data warehouse design, data extraction and manipulation, incident root-cause analysis, planning reports and Power BI delivery.</w:t>
       </w:r>
     </w:p>
     <w:p>
       <w:pPr>
         <w:pStyle w:val="Heading3"/>
-        <w:spacing w:lineRule="auto"/>
-      </w:pPr>
-      <w:r>
-        <w:rPr/>
-        <w:t xml:space="preserve">Database Administrator | Bidvest Magnum</w:t>
-      </w:r>
-    </w:p>
-    <w:p>
-      <w:pPr>
-        <w:spacing w:lineRule="auto"/>
-      </w:pPr>
-      <w:r>
-        <w:rPr/>
-        <w:t xml:space="preserve">December 2008 - April 2012</w:t>
+      </w:pPr>
+      <w:r>
+        <w:t>Database Administrator | Bidvest Magnum</w:t>
+      </w:r>
+    </w:p>
+    <w:p>
+      <w:r>
+        <w:t>December 2008 - April 2012</w:t>
       </w:r>
     </w:p>
     <w:p>
@@ -525,30 +452,22 @@
           <w:ilvl w:val="0"/>
           <w:numId w:val="10"/>
         </w:numPr>
-        <w:spacing w:lineRule="auto"/>
-      </w:pPr>
-      <w:r>
-        <w:rPr/>
-        <w:t xml:space="preserve">Administered SQL and BI platforms, operational reporting, SharePoint and ERP data integrations in a security-services environment.</w:t>
+      </w:pPr>
+      <w:r>
+        <w:t>Administered SQL and BI platforms, operational reporting, SharePoint and ERP data integrations in a security-services environment.</w:t>
       </w:r>
     </w:p>
     <w:p>
       <w:pPr>
         <w:pStyle w:val="Heading3"/>
-        <w:spacing w:lineRule="auto"/>
-      </w:pPr>
-      <w:r>
-        <w:rPr/>
-        <w:t xml:space="preserve">Technical Analyst / Software Developer | SekChek Information Protection and Teknatic</w:t>
-      </w:r>
-    </w:p>
-    <w:p>
-      <w:pPr>
-        <w:spacing w:lineRule="auto"/>
-      </w:pPr>
-      <w:r>
-        <w:rPr/>
-        <w:t xml:space="preserve">January 2005 - November 2008</w:t>
+      </w:pPr>
+      <w:r>
+        <w:t>Technical Analyst / Software Developer | SekChek Information Protection and Teknatic</w:t>
+      </w:r>
+    </w:p>
+    <w:p>
+      <w:r>
+        <w:t>January 2005 - November 2008</w:t>
       </w:r>
     </w:p>
     <w:p>
@@ -557,21 +476,17 @@
           <w:ilvl w:val="0"/>
           <w:numId w:val="11"/>
         </w:numPr>
-        <w:spacing w:lineRule="auto"/>
-      </w:pPr>
-      <w:r>
-        <w:rPr/>
-        <w:t xml:space="preserve">Developed and supported monitoring, risk-control and enterprise information systems; performed testing, debugging, technical support and training.</w:t>
+      </w:pPr>
+      <w:r>
+        <w:t>Developed and supported monitoring, risk-control and enterprise information systems; performed testing, debugging, technical support and training.</w:t>
       </w:r>
     </w:p>
     <w:p>
       <w:pPr>
         <w:pStyle w:val="Heading2"/>
-        <w:spacing w:lineRule="auto"/>
-      </w:pPr>
-      <w:r>
-        <w:rPr/>
-        <w:t xml:space="preserve">Education and Certifications</w:t>
+      </w:pPr>
+      <w:r>
+        <w:t>Education and Certifications</w:t>
       </w:r>
     </w:p>
     <w:p>
@@ -580,11 +495,9 @@
           <w:ilvl w:val="0"/>
           <w:numId w:val="12"/>
         </w:numPr>
-        <w:spacing w:lineRule="auto"/>
-      </w:pPr>
-      <w:r>
-        <w:rPr/>
-        <w:t xml:space="preserve">National Diploma in Information Technology, Mangosuthu Technikon, 2003.</w:t>
+      </w:pPr>
+      <w:r>
+        <w:t>National Diploma in Information Technology, Mangosuthu Technikon, 2003.</w:t>
       </w:r>
     </w:p>
     <w:p>
@@ -593,11 +506,9 @@
           <w:ilvl w:val="0"/>
           <w:numId w:val="12"/>
         </w:numPr>
-        <w:spacing w:lineRule="auto"/>
-      </w:pPr>
-      <w:r>
-        <w:rPr/>
-        <w:t xml:space="preserve">Microsoft Certified: Azure Data Engineer Associate (DP-203).</w:t>
+      </w:pPr>
+      <w:r>
+        <w:t>Microsoft Certified: Azure Data Engineer Associate (DP-203).</w:t>
       </w:r>
     </w:p>
     <w:p>
@@ -606,11 +517,9 @@
           <w:ilvl w:val="0"/>
           <w:numId w:val="12"/>
         </w:numPr>
-        <w:spacing w:lineRule="auto"/>
-      </w:pPr>
-      <w:r>
-        <w:rPr/>
-        <w:t xml:space="preserve">Microsoft Exam 70-461: Querying Microsoft SQL Server 2012/2014.</w:t>
+      </w:pPr>
+      <w:r>
+        <w:t>Microsoft Exam 70-461: Querying Microsoft SQL Server 2012/2014.</w:t>
       </w:r>
     </w:p>
     <w:p>
@@ -619,39 +528,39 @@
           <w:ilvl w:val="0"/>
           <w:numId w:val="12"/>
         </w:numPr>
-        <w:spacing w:lineRule="auto"/>
-      </w:pPr>
-      <w:r>
-        <w:rPr/>
-        <w:t xml:space="preserve">Certified Data Vault 2.0 Practitioner.</w:t>
+      </w:pPr>
+      <w:r>
+        <w:t>Certified Data Vault 2.0 Practitioner.</w:t>
       </w:r>
     </w:p>
     <w:p>
       <w:pPr>
         <w:pStyle w:val="Heading2"/>
-        <w:spacing w:lineRule="auto"/>
-      </w:pPr>
-      <w:r>
-        <w:rPr/>
-        <w:t xml:space="preserve">Languages</w:t>
-      </w:r>
-    </w:p>
-    <w:p>
-      <w:pPr>
-        <w:spacing w:lineRule="auto"/>
-      </w:pPr>
-      <w:r>
-        <w:rPr/>
-        <w:t xml:space="preserve">English, isiXhosa and isiZulu.</w:t>
-      </w:r>
-    </w:p>
+      </w:pPr>
+      <w:r>
+        <w:t>Languages</w:t>
+      </w:r>
+    </w:p>
+    <w:p>
+      <w:r>
+        <w:t>English, isiXhosa and isiZulu.</w:t>
+      </w:r>
+    </w:p>
+    <w:sectPr>
+      <w:pgSz w:w="12240" w:h="15840"/>
+      <w:pgMar w:top="1440" w:right="1800" w:bottom="1440" w:left="1800" w:header="720" w:footer="720" w:gutter="0"/>
+      <w:cols w:space="720"/>
+    </w:sectPr>
   </w:body>
 </w:document>
 </file>
 
 <file path=word/numbering.xml><?xml version="1.0" encoding="utf-8"?>
-<w:numbering xmlns:w="http://schemas.openxmlformats.org/wordprocessingml/2006/main" xmlns:ve="http://schemas.openxmlformats.org/markup-compatibility/2006" xmlns:o="urn:schemas-microsoft-com:office:office" xmlns:r="http://schemas.openxmlformats.org/officeDocument/2006/relationships" xmlns:v="urn:schemas-microsoft-com:vml" xmlns:wp="http://schemas.openxmlformats.org/drawingml/2006/wordprocessingDrawing" xmlns:w10="urn:schemas-microsoft-com:office:word" xmlns:wne="http://schemas.microsoft.com/office/word/2006/wordml">
-  <w:abstractNum w:abstractNumId="1">
+<w:numbering xmlns:wpc="http://schemas.microsoft.com/office/word/2010/wordprocessingCanvas" xmlns:cx="http://schemas.microsoft.com/office/drawing/2014/chartex" xmlns:cx1="http://schemas.microsoft.com/office/drawing/2015/9/8/chartex" xmlns:cx2="http://schemas.microsoft.com/office/drawing/2015/10/21/chartex" xmlns:cx3="http://schemas.microsoft.com/office/drawing/2016/5/9/chartex" xmlns:cx4="http://schemas.microsoft.com/office/drawing/2016/5/10/chartex" xmlns:cx5="http://schemas.microsoft.com/office/drawing/2016/5/11/chartex" xmlns:cx6="http://schemas.microsoft.com/office/drawing/2016/5/12/chartex" xmlns:cx7="http://schemas.microsoft.com/office/drawing/2016/5/13/chartex" xmlns:cx8="http://schemas.microsoft.com/office/drawing/2016/5/14/chartex" xmlns:mc="http://schemas.openxmlformats.org/markup-compatibility/2006" xmlns:aink="http://schemas.microsoft.com/office/drawing/2016/ink" xmlns:am3d="http://schemas.microsoft.com/office/drawing/2017/model3d" xmlns:o="urn:schemas-microsoft-com:office:office" xmlns:oel="http://schemas.microsoft.com/office/2019/extlst" xmlns:r="http://schemas.openxmlformats.org/officeDocument/2006/relationships" xmlns:m="http://schemas.openxmlformats.org/officeDocument/2006/math" xmlns:v="urn:schemas-microsoft-com:vml" xmlns:wp14="http://schemas.microsoft.com/office/word/2010/wordprocessingDrawing" xmlns:wp="http://schemas.openxmlformats.org/drawingml/2006/wordprocessingDrawing" xmlns:w10="urn:schemas-microsoft-com:office:word" xmlns:w="http://schemas.openxmlformats.org/wordprocessingml/2006/main" xmlns:w14="http://schemas.microsoft.com/office/word/2010/wordml" xmlns:w15="http://schemas.microsoft.com/office/word/2012/wordml" xmlns:w16cex="http://schemas.microsoft.com/office/word/2018/wordml/cex" xmlns:w16cid="http://schemas.microsoft.com/office/word/2016/wordml/cid" xmlns:w16="http://schemas.microsoft.com/office/word/2018/wordml" xmlns:w16du="http://schemas.microsoft.com/office/word/2023/wordml/word16du" xmlns:w16sdtdh="http://schemas.microsoft.com/office/word/2020/wordml/sdtdatahash" xmlns:w16sdtfl="http://schemas.microsoft.com/office/word/2024/wordml/sdtformatlock" xmlns:w16se="http://schemas.microsoft.com/office/word/2015/wordml/symex" xmlns:wpg="http://schemas.microsoft.com/office/word/2010/wordprocessingGroup" xmlns:wpi="http://schemas.microsoft.com/office/word/2010/wordprocessingInk" xmlns:wne="http://schemas.microsoft.com/office/word/2006/wordml" xmlns:wps="http://schemas.microsoft.com/office/word/2010/wordprocessingShape" mc:Ignorable="w14 w15 w16se w16cid w16 w16cex w16sdtdh w16sdtfl w16du wp14">
+  <w:abstractNum w:abstractNumId="0" w15:restartNumberingAfterBreak="0">
+    <w:nsid w:val="018F7CA8"/>
+    <w:multiLevelType w:val="multilevel"/>
+    <w:tmpl w:val="0BD687E2"/>
     <w:lvl w:ilvl="0">
       <w:start w:val="1"/>
       <w:numFmt w:val="bullet"/>
@@ -772,8 +681,16 @@
         <w:rFonts w:ascii="Symbol" w:hAnsi="Symbol" w:hint="default"/>
       </w:rPr>
     </w:lvl>
+    <w:lvl w:ilvl="8">
+      <w:numFmt w:val="decimal"/>
+      <w:lvlText w:val=""/>
+      <w:lvlJc w:val="left"/>
+    </w:lvl>
   </w:abstractNum>
-  <w:abstractNum w:abstractNumId="2">
+  <w:abstractNum w:abstractNumId="1" w15:restartNumberingAfterBreak="0">
+    <w:nsid w:val="02470F3D"/>
+    <w:multiLevelType w:val="multilevel"/>
+    <w:tmpl w:val="926CDE54"/>
     <w:lvl w:ilvl="0">
       <w:start w:val="1"/>
       <w:numFmt w:val="bullet"/>
@@ -894,8 +811,16 @@
         <w:rFonts w:ascii="Symbol" w:hAnsi="Symbol" w:hint="default"/>
       </w:rPr>
     </w:lvl>
+    <w:lvl w:ilvl="8">
+      <w:numFmt w:val="decimal"/>
+      <w:lvlText w:val=""/>
+      <w:lvlJc w:val="left"/>
+    </w:lvl>
   </w:abstractNum>
-  <w:abstractNum w:abstractNumId="3">
+  <w:abstractNum w:abstractNumId="2" w15:restartNumberingAfterBreak="0">
+    <w:nsid w:val="08D17240"/>
+    <w:multiLevelType w:val="multilevel"/>
+    <w:tmpl w:val="8158ABFA"/>
     <w:lvl w:ilvl="0">
       <w:start w:val="1"/>
       <w:numFmt w:val="bullet"/>
@@ -1016,8 +941,16 @@
         <w:rFonts w:ascii="Symbol" w:hAnsi="Symbol" w:hint="default"/>
       </w:rPr>
     </w:lvl>
+    <w:lvl w:ilvl="8">
+      <w:numFmt w:val="decimal"/>
+      <w:lvlText w:val=""/>
+      <w:lvlJc w:val="left"/>
+    </w:lvl>
   </w:abstractNum>
-  <w:abstractNum w:abstractNumId="4">
+  <w:abstractNum w:abstractNumId="3" w15:restartNumberingAfterBreak="0">
+    <w:nsid w:val="104141B8"/>
+    <w:multiLevelType w:val="multilevel"/>
+    <w:tmpl w:val="F59AC1D6"/>
     <w:lvl w:ilvl="0">
       <w:start w:val="1"/>
       <w:numFmt w:val="bullet"/>
@@ -1138,8 +1071,16 @@
         <w:rFonts w:ascii="Symbol" w:hAnsi="Symbol" w:hint="default"/>
       </w:rPr>
     </w:lvl>
+    <w:lvl w:ilvl="8">
+      <w:numFmt w:val="decimal"/>
+      <w:lvlText w:val=""/>
+      <w:lvlJc w:val="left"/>
+    </w:lvl>
   </w:abstractNum>
-  <w:abstractNum w:abstractNumId="5">
+  <w:abstractNum w:abstractNumId="4" w15:restartNumberingAfterBreak="0">
+    <w:nsid w:val="131C3C61"/>
+    <w:multiLevelType w:val="multilevel"/>
+    <w:tmpl w:val="2892EB16"/>
     <w:lvl w:ilvl="0">
       <w:start w:val="1"/>
       <w:numFmt w:val="bullet"/>
@@ -1260,8 +1201,16 @@
         <w:rFonts w:ascii="Symbol" w:hAnsi="Symbol" w:hint="default"/>
       </w:rPr>
     </w:lvl>
+    <w:lvl w:ilvl="8">
+      <w:numFmt w:val="decimal"/>
+      <w:lvlText w:val=""/>
+      <w:lvlJc w:val="left"/>
+    </w:lvl>
   </w:abstractNum>
-  <w:abstractNum w:abstractNumId="6">
+  <w:abstractNum w:abstractNumId="5" w15:restartNumberingAfterBreak="0">
+    <w:nsid w:val="2E79239D"/>
+    <w:multiLevelType w:val="multilevel"/>
+    <w:tmpl w:val="F15866AE"/>
     <w:lvl w:ilvl="0">
       <w:start w:val="1"/>
       <w:numFmt w:val="bullet"/>
@@ -1382,8 +1331,16 @@
         <w:rFonts w:ascii="Symbol" w:hAnsi="Symbol" w:hint="default"/>
       </w:rPr>
     </w:lvl>
+    <w:lvl w:ilvl="8">
+      <w:numFmt w:val="decimal"/>
+      <w:lvlText w:val=""/>
+      <w:lvlJc w:val="left"/>
+    </w:lvl>
   </w:abstractNum>
-  <w:abstractNum w:abstractNumId="7">
+  <w:abstractNum w:abstractNumId="6" w15:restartNumberingAfterBreak="0">
+    <w:nsid w:val="624C47DC"/>
+    <w:multiLevelType w:val="multilevel"/>
+    <w:tmpl w:val="0D6E976E"/>
     <w:lvl w:ilvl="0">
       <w:start w:val="1"/>
       <w:numFmt w:val="bullet"/>
@@ -1504,8 +1461,16 @@
         <w:rFonts w:ascii="Symbol" w:hAnsi="Symbol" w:hint="default"/>
       </w:rPr>
     </w:lvl>
+    <w:lvl w:ilvl="8">
+      <w:numFmt w:val="decimal"/>
+      <w:lvlText w:val=""/>
+      <w:lvlJc w:val="left"/>
+    </w:lvl>
   </w:abstractNum>
-  <w:abstractNum w:abstractNumId="8">
+  <w:abstractNum w:abstractNumId="7" w15:restartNumberingAfterBreak="0">
+    <w:nsid w:val="6BE50E28"/>
+    <w:multiLevelType w:val="multilevel"/>
+    <w:tmpl w:val="7B001034"/>
     <w:lvl w:ilvl="0">
       <w:start w:val="1"/>
       <w:numFmt w:val="bullet"/>
@@ -1626,8 +1591,16 @@
         <w:rFonts w:ascii="Symbol" w:hAnsi="Symbol" w:hint="default"/>
       </w:rPr>
     </w:lvl>
+    <w:lvl w:ilvl="8">
+      <w:numFmt w:val="decimal"/>
+      <w:lvlText w:val=""/>
+      <w:lvlJc w:val="left"/>
+    </w:lvl>
   </w:abstractNum>
-  <w:abstractNum w:abstractNumId="9">
+  <w:abstractNum w:abstractNumId="8" w15:restartNumberingAfterBreak="0">
+    <w:nsid w:val="6E56316A"/>
+    <w:multiLevelType w:val="multilevel"/>
+    <w:tmpl w:val="F3221028"/>
     <w:lvl w:ilvl="0">
       <w:start w:val="1"/>
       <w:numFmt w:val="bullet"/>
@@ -1748,8 +1721,16 @@
         <w:rFonts w:ascii="Symbol" w:hAnsi="Symbol" w:hint="default"/>
       </w:rPr>
     </w:lvl>
+    <w:lvl w:ilvl="8">
+      <w:numFmt w:val="decimal"/>
+      <w:lvlText w:val=""/>
+      <w:lvlJc w:val="left"/>
+    </w:lvl>
   </w:abstractNum>
-  <w:abstractNum w:abstractNumId="10">
+  <w:abstractNum w:abstractNumId="9" w15:restartNumberingAfterBreak="0">
+    <w:nsid w:val="74F77E8D"/>
+    <w:multiLevelType w:val="multilevel"/>
+    <w:tmpl w:val="51E66122"/>
     <w:lvl w:ilvl="0">
       <w:start w:val="1"/>
       <w:numFmt w:val="bullet"/>
@@ -1870,8 +1851,16 @@
         <w:rFonts w:ascii="Symbol" w:hAnsi="Symbol" w:hint="default"/>
       </w:rPr>
     </w:lvl>
+    <w:lvl w:ilvl="8">
+      <w:numFmt w:val="decimal"/>
+      <w:lvlText w:val=""/>
+      <w:lvlJc w:val="left"/>
+    </w:lvl>
   </w:abstractNum>
-  <w:abstractNum w:abstractNumId="11">
+  <w:abstractNum w:abstractNumId="10" w15:restartNumberingAfterBreak="0">
+    <w:nsid w:val="7C713C9D"/>
+    <w:multiLevelType w:val="multilevel"/>
+    <w:tmpl w:val="3F840CFA"/>
     <w:lvl w:ilvl="0">
       <w:start w:val="1"/>
       <w:numFmt w:val="bullet"/>
@@ -1992,8 +1981,16 @@
         <w:rFonts w:ascii="Symbol" w:hAnsi="Symbol" w:hint="default"/>
       </w:rPr>
     </w:lvl>
+    <w:lvl w:ilvl="8">
+      <w:numFmt w:val="decimal"/>
+      <w:lvlText w:val=""/>
+      <w:lvlJc w:val="left"/>
+    </w:lvl>
   </w:abstractNum>
-  <w:abstractNum w:abstractNumId="12">
+  <w:abstractNum w:abstractNumId="11" w15:restartNumberingAfterBreak="0">
+    <w:nsid w:val="7F471493"/>
+    <w:multiLevelType w:val="multilevel"/>
+    <w:tmpl w:val="25348ECE"/>
     <w:lvl w:ilvl="0">
       <w:start w:val="1"/>
       <w:numFmt w:val="bullet"/>
@@ -2114,48 +2111,53 @@
         <w:rFonts w:ascii="Symbol" w:hAnsi="Symbol" w:hint="default"/>
       </w:rPr>
     </w:lvl>
+    <w:lvl w:ilvl="8">
+      <w:numFmt w:val="decimal"/>
+      <w:lvlText w:val=""/>
+      <w:lvlJc w:val="left"/>
+    </w:lvl>
   </w:abstractNum>
-  <w:num w:numId="1">
+  <w:num w:numId="1" w16cid:durableId="1002587496">
+    <w:abstractNumId w:val="10"/>
+  </w:num>
+  <w:num w:numId="2" w16cid:durableId="1917397119">
+    <w:abstractNumId w:val="9"/>
+  </w:num>
+  <w:num w:numId="3" w16cid:durableId="1762333496">
+    <w:abstractNumId w:val="2"/>
+  </w:num>
+  <w:num w:numId="4" w16cid:durableId="180974117">
+    <w:abstractNumId w:val="6"/>
+  </w:num>
+  <w:num w:numId="5" w16cid:durableId="264776238">
+    <w:abstractNumId w:val="3"/>
+  </w:num>
+  <w:num w:numId="6" w16cid:durableId="216094432">
+    <w:abstractNumId w:val="4"/>
+  </w:num>
+  <w:num w:numId="7" w16cid:durableId="1971668742">
     <w:abstractNumId w:val="1"/>
   </w:num>
-  <w:num w:numId="2">
-    <w:abstractNumId w:val="2"/>
+  <w:num w:numId="8" w16cid:durableId="792745328">
+    <w:abstractNumId w:val="8"/>
   </w:num>
-  <w:num w:numId="3">
-    <w:abstractNumId w:val="3"/>
+  <w:num w:numId="9" w16cid:durableId="1735354025">
+    <w:abstractNumId w:val="0"/>
   </w:num>
-  <w:num w:numId="4">
-    <w:abstractNumId w:val="4"/>
+  <w:num w:numId="10" w16cid:durableId="757865387">
+    <w:abstractNumId w:val="11"/>
   </w:num>
-  <w:num w:numId="5">
+  <w:num w:numId="11" w16cid:durableId="1364597715">
     <w:abstractNumId w:val="5"/>
   </w:num>
-  <w:num w:numId="6">
-    <w:abstractNumId w:val="6"/>
-  </w:num>
-  <w:num w:numId="7">
+  <w:num w:numId="12" w16cid:durableId="457721206">
     <w:abstractNumId w:val="7"/>
-  </w:num>
-  <w:num w:numId="8">
-    <w:abstractNumId w:val="8"/>
-  </w:num>
-  <w:num w:numId="9">
-    <w:abstractNumId w:val="9"/>
-  </w:num>
-  <w:num w:numId="10">
-    <w:abstractNumId w:val="10"/>
-  </w:num>
-  <w:num w:numId="11">
-    <w:abstractNumId w:val="11"/>
-  </w:num>
-  <w:num w:numId="12">
-    <w:abstractNumId w:val="12"/>
   </w:num>
 </w:numbering>
 </file>
 
 <file path=word/styles.xml><?xml version="1.0" encoding="utf-8"?>
-<w:styles xmlns:w="http://schemas.openxmlformats.org/wordprocessingml/2006/main" xmlns:r="http://schemas.openxmlformats.org/officeDocument/2006/relationships">
+<w:styles xmlns:mc="http://schemas.openxmlformats.org/markup-compatibility/2006" xmlns:r="http://schemas.openxmlformats.org/officeDocument/2006/relationships" xmlns:w="http://schemas.openxmlformats.org/wordprocessingml/2006/main" xmlns:w14="http://schemas.microsoft.com/office/word/2010/wordml" xmlns:w15="http://schemas.microsoft.com/office/word/2012/wordml" xmlns:w16cex="http://schemas.microsoft.com/office/word/2018/wordml/cex" xmlns:w16cid="http://schemas.microsoft.com/office/word/2016/wordml/cid" xmlns:w16="http://schemas.microsoft.com/office/word/2018/wordml" xmlns:w16du="http://schemas.microsoft.com/office/word/2023/wordml/word16du" xmlns:w16sdtdh="http://schemas.microsoft.com/office/word/2020/wordml/sdtdatahash" xmlns:w16sdtfl="http://schemas.microsoft.com/office/word/2024/wordml/sdtformatlock" xmlns:w16se="http://schemas.microsoft.com/office/word/2015/wordml/symex" mc:Ignorable="w14 w15 w16se w16cid w16 w16cex w16sdtdh w16sdtfl w16du">
   <w:docDefaults>
     <w:rPrDefault>
       <w:rPr>
@@ -2171,17 +2173,390 @@
       </w:pPr>
     </w:pPrDefault>
   </w:docDefaults>
-  <w:style w:type="character" w:styleId="Hyperlink">
-    <w:name w:val="Hyperlink"/>
-    <w:rPr>
-      <w:color w:val="0000FF"/>
-      <w:u w:val="single"/>
-    </w:rPr>
+  <w:latentStyles w:defLockedState="0" w:defUIPriority="99" w:defSemiHidden="0" w:defUnhideWhenUsed="0" w:defQFormat="0" w:count="376">
+    <w:lsdException w:name="Normal" w:uiPriority="0" w:qFormat="1"/>
+    <w:lsdException w:name="heading 1" w:uiPriority="9" w:qFormat="1"/>
+    <w:lsdException w:name="heading 2" w:semiHidden="1" w:uiPriority="9" w:unhideWhenUsed="1" w:qFormat="1"/>
+    <w:lsdException w:name="heading 3" w:semiHidden="1" w:uiPriority="9" w:unhideWhenUsed="1" w:qFormat="1"/>
+    <w:lsdException w:name="heading 4" w:semiHidden="1" w:uiPriority="9" w:unhideWhenUsed="1" w:qFormat="1"/>
+    <w:lsdException w:name="heading 5" w:semiHidden="1" w:uiPriority="9" w:unhideWhenUsed="1" w:qFormat="1"/>
+    <w:lsdException w:name="heading 6" w:semiHidden="1" w:uiPriority="9" w:unhideWhenUsed="1" w:qFormat="1"/>
+    <w:lsdException w:name="heading 7" w:semiHidden="1" w:uiPriority="9" w:unhideWhenUsed="1" w:qFormat="1"/>
+    <w:lsdException w:name="heading 8" w:semiHidden="1" w:uiPriority="9" w:unhideWhenUsed="1" w:qFormat="1"/>
+    <w:lsdException w:name="heading 9" w:semiHidden="1" w:uiPriority="9" w:unhideWhenUsed="1" w:qFormat="1"/>
+    <w:lsdException w:name="index 1" w:semiHidden="1" w:unhideWhenUsed="1"/>
+    <w:lsdException w:name="index 2" w:semiHidden="1" w:unhideWhenUsed="1"/>
+    <w:lsdException w:name="index 3" w:semiHidden="1" w:unhideWhenUsed="1"/>
+    <w:lsdException w:name="index 4" w:semiHidden="1" w:unhideWhenUsed="1"/>
+    <w:lsdException w:name="index 5" w:semiHidden="1" w:unhideWhenUsed="1"/>
+    <w:lsdException w:name="index 6" w:semiHidden="1" w:unhideWhenUsed="1"/>
+    <w:lsdException w:name="index 7" w:semiHidden="1" w:unhideWhenUsed="1"/>
+    <w:lsdException w:name="index 8" w:semiHidden="1" w:unhideWhenUsed="1"/>
+    <w:lsdException w:name="index 9" w:semiHidden="1" w:unhideWhenUsed="1"/>
+    <w:lsdException w:name="toc 1" w:semiHidden="1" w:uiPriority="39" w:unhideWhenUsed="1"/>
+    <w:lsdException w:name="toc 2" w:semiHidden="1" w:uiPriority="39" w:unhideWhenUsed="1"/>
+    <w:lsdException w:name="toc 3" w:semiHidden="1" w:uiPriority="39" w:unhideWhenUsed="1"/>
+    <w:lsdException w:name="toc 4" w:semiHidden="1" w:uiPriority="39" w:unhideWhenUsed="1"/>
+    <w:lsdException w:name="toc 5" w:semiHidden="1" w:uiPriority="39" w:unhideWhenUsed="1"/>
+    <w:lsdException w:name="toc 6" w:semiHidden="1" w:uiPriority="39" w:unhideWhenUsed="1"/>
+    <w:lsdException w:name="toc 7" w:semiHidden="1" w:uiPriority="39" w:unhideWhenUsed="1"/>
+    <w:lsdException w:name="toc 8" w:semiHidden="1" w:uiPriority="39" w:unhideWhenUsed="1"/>
+    <w:lsdException w:name="toc 9" w:semiHidden="1" w:uiPriority="39" w:unhideWhenUsed="1"/>
+    <w:lsdException w:name="Normal Indent" w:semiHidden="1" w:unhideWhenUsed="1"/>
+    <w:lsdException w:name="footnote text" w:semiHidden="1" w:unhideWhenUsed="1"/>
+    <w:lsdException w:name="annotation text" w:semiHidden="1" w:unhideWhenUsed="1"/>
+    <w:lsdException w:name="header" w:semiHidden="1" w:unhideWhenUsed="1"/>
+    <w:lsdException w:name="footer" w:semiHidden="1" w:unhideWhenUsed="1"/>
+    <w:lsdException w:name="index heading" w:semiHidden="1" w:unhideWhenUsed="1"/>
+    <w:lsdException w:name="caption" w:semiHidden="1" w:uiPriority="35" w:unhideWhenUsed="1" w:qFormat="1"/>
+    <w:lsdException w:name="table of figures" w:semiHidden="1" w:unhideWhenUsed="1"/>
+    <w:lsdException w:name="envelope address" w:semiHidden="1" w:unhideWhenUsed="1"/>
+    <w:lsdException w:name="envelope return" w:semiHidden="1" w:unhideWhenUsed="1"/>
+    <w:lsdException w:name="footnote reference" w:semiHidden="1" w:unhideWhenUsed="1"/>
+    <w:lsdException w:name="annotation reference" w:semiHidden="1" w:unhideWhenUsed="1"/>
+    <w:lsdException w:name="line number" w:semiHidden="1" w:unhideWhenUsed="1"/>
+    <w:lsdException w:name="page number" w:semiHidden="1" w:unhideWhenUsed="1"/>
+    <w:lsdException w:name="endnote reference" w:semiHidden="1" w:unhideWhenUsed="1"/>
+    <w:lsdException w:name="endnote text" w:semiHidden="1" w:unhideWhenUsed="1"/>
+    <w:lsdException w:name="table of authorities" w:semiHidden="1" w:unhideWhenUsed="1"/>
+    <w:lsdException w:name="macro" w:semiHidden="1" w:unhideWhenUsed="1"/>
+    <w:lsdException w:name="toa heading" w:semiHidden="1" w:unhideWhenUsed="1"/>
+    <w:lsdException w:name="List" w:semiHidden="1" w:unhideWhenUsed="1"/>
+    <w:lsdException w:name="List Bullet" w:semiHidden="1" w:unhideWhenUsed="1"/>
+    <w:lsdException w:name="List Number" w:semiHidden="1" w:unhideWhenUsed="1"/>
+    <w:lsdException w:name="List 2" w:semiHidden="1" w:unhideWhenUsed="1"/>
+    <w:lsdException w:name="List 3" w:semiHidden="1" w:unhideWhenUsed="1"/>
+    <w:lsdException w:name="List 4" w:semiHidden="1" w:unhideWhenUsed="1"/>
+    <w:lsdException w:name="List 5" w:semiHidden="1" w:unhideWhenUsed="1"/>
+    <w:lsdException w:name="List Bullet 2" w:semiHidden="1" w:unhideWhenUsed="1"/>
+    <w:lsdException w:name="List Bullet 3" w:semiHidden="1" w:unhideWhenUsed="1"/>
+    <w:lsdException w:name="List Bullet 4" w:semiHidden="1" w:unhideWhenUsed="1"/>
+    <w:lsdException w:name="List Bullet 5" w:semiHidden="1" w:unhideWhenUsed="1"/>
+    <w:lsdException w:name="List Number 2" w:semiHidden="1" w:unhideWhenUsed="1"/>
+    <w:lsdException w:name="List Number 3" w:semiHidden="1" w:unhideWhenUsed="1"/>
+    <w:lsdException w:name="List Number 4" w:semiHidden="1" w:unhideWhenUsed="1"/>
+    <w:lsdException w:name="List Number 5" w:semiHidden="1" w:unhideWhenUsed="1"/>
+    <w:lsdException w:name="Title" w:uiPriority="10" w:qFormat="1"/>
+    <w:lsdException w:name="Closing" w:semiHidden="1" w:unhideWhenUsed="1"/>
+    <w:lsdException w:name="Signature" w:semiHidden="1" w:unhideWhenUsed="1"/>
+    <w:lsdException w:name="Default Paragraph Font" w:semiHidden="1" w:uiPriority="1" w:unhideWhenUsed="1"/>
+    <w:lsdException w:name="Body Text" w:semiHidden="1" w:unhideWhenUsed="1"/>
+    <w:lsdException w:name="Body Text Indent" w:semiHidden="1" w:unhideWhenUsed="1"/>
+    <w:lsdException w:name="List Continue" w:semiHidden="1" w:unhideWhenUsed="1"/>
+    <w:lsdException w:name="List Continue 2" w:semiHidden="1" w:unhideWhenUsed="1"/>
+    <w:lsdException w:name="List Continue 3" w:semiHidden="1" w:unhideWhenUsed="1"/>
+    <w:lsdException w:name="List Continue 4" w:semiHidden="1" w:unhideWhenUsed="1"/>
+    <w:lsdException w:name="List Continue 5" w:semiHidden="1" w:unhideWhenUsed="1"/>
+    <w:lsdException w:name="Message Header" w:semiHidden="1" w:unhideWhenUsed="1"/>
+    <w:lsdException w:name="Subtitle" w:uiPriority="11" w:qFormat="1"/>
+    <w:lsdException w:name="Salutation" w:semiHidden="1" w:unhideWhenUsed="1"/>
+    <w:lsdException w:name="Date" w:semiHidden="1" w:unhideWhenUsed="1"/>
+    <w:lsdException w:name="Body Text First Indent" w:semiHidden="1" w:unhideWhenUsed="1"/>
+    <w:lsdException w:name="Body Text First Indent 2" w:semiHidden="1" w:unhideWhenUsed="1"/>
+    <w:lsdException w:name="Note Heading" w:semiHidden="1" w:unhideWhenUsed="1"/>
+    <w:lsdException w:name="Body Text 2" w:semiHidden="1" w:unhideWhenUsed="1"/>
+    <w:lsdException w:name="Body Text 3" w:semiHidden="1" w:unhideWhenUsed="1"/>
+    <w:lsdException w:name="Body Text Indent 2" w:semiHidden="1" w:unhideWhenUsed="1"/>
+    <w:lsdException w:name="Body Text Indent 3" w:semiHidden="1" w:unhideWhenUsed="1"/>
+    <w:lsdException w:name="Block Text" w:semiHidden="1" w:unhideWhenUsed="1"/>
+    <w:lsdException w:name="Hyperlink" w:semiHidden="1" w:unhideWhenUsed="1"/>
+    <w:lsdException w:name="FollowedHyperlink" w:semiHidden="1" w:unhideWhenUsed="1"/>
+    <w:lsdException w:name="Strong" w:uiPriority="22" w:qFormat="1"/>
+    <w:lsdException w:name="Emphasis" w:uiPriority="20" w:qFormat="1"/>
+    <w:lsdException w:name="Document Map" w:semiHidden="1" w:unhideWhenUsed="1"/>
+    <w:lsdException w:name="Plain Text" w:semiHidden="1" w:unhideWhenUsed="1"/>
+    <w:lsdException w:name="E-mail Signature" w:semiHidden="1" w:unhideWhenUsed="1"/>
+    <w:lsdException w:name="HTML Top of Form" w:semiHidden="1" w:unhideWhenUsed="1"/>
+    <w:lsdException w:name="HTML Bottom of Form" w:semiHidden="1" w:unhideWhenUsed="1"/>
+    <w:lsdException w:name="Normal (Web)" w:semiHidden="1" w:unhideWhenUsed="1"/>
+    <w:lsdException w:name="HTML Acronym" w:semiHidden="1" w:unhideWhenUsed="1"/>
+    <w:lsdException w:name="HTML Address" w:semiHidden="1" w:unhideWhenUsed="1"/>
+    <w:lsdException w:name="HTML Cite" w:semiHidden="1" w:unhideWhenUsed="1"/>
+    <w:lsdException w:name="HTML Code" w:semiHidden="1" w:unhideWhenUsed="1"/>
+    <w:lsdException w:name="HTML Definition" w:semiHidden="1" w:unhideWhenUsed="1"/>
+    <w:lsdException w:name="HTML Keyboard" w:semiHidden="1" w:unhideWhenUsed="1"/>
+    <w:lsdException w:name="HTML Preformatted" w:semiHidden="1" w:unhideWhenUsed="1"/>
+    <w:lsdException w:name="HTML Sample" w:semiHidden="1" w:unhideWhenUsed="1"/>
+    <w:lsdException w:name="HTML Typewriter" w:semiHidden="1" w:unhideWhenUsed="1"/>
+    <w:lsdException w:name="HTML Variable" w:semiHidden="1" w:unhideWhenUsed="1"/>
+    <w:lsdException w:name="Normal Table" w:semiHidden="1" w:unhideWhenUsed="1"/>
+    <w:lsdException w:name="annotation subject" w:semiHidden="1" w:unhideWhenUsed="1"/>
+    <w:lsdException w:name="No List" w:semiHidden="1" w:unhideWhenUsed="1"/>
+    <w:lsdException w:name="Outline List 1" w:semiHidden="1" w:unhideWhenUsed="1"/>
+    <w:lsdException w:name="Outline List 2" w:semiHidden="1" w:unhideWhenUsed="1"/>
+    <w:lsdException w:name="Outline List 3" w:semiHidden="1" w:unhideWhenUsed="1"/>
+    <w:lsdException w:name="Table Simple 1" w:semiHidden="1" w:unhideWhenUsed="1"/>
+    <w:lsdException w:name="Table Simple 2" w:semiHidden="1" w:unhideWhenUsed="1"/>
+    <w:lsdException w:name="Table Simple 3" w:semiHidden="1" w:unhideWhenUsed="1"/>
+    <w:lsdException w:name="Table Classic 1" w:semiHidden="1" w:unhideWhenUsed="1"/>
+    <w:lsdException w:name="Table Classic 2" w:semiHidden="1" w:unhideWhenUsed="1"/>
+    <w:lsdException w:name="Table Classic 3" w:semiHidden="1" w:unhideWhenUsed="1"/>
+    <w:lsdException w:name="Table Classic 4" w:semiHidden="1" w:unhideWhenUsed="1"/>
+    <w:lsdException w:name="Table Colorful 1" w:semiHidden="1" w:unhideWhenUsed="1"/>
+    <w:lsdException w:name="Table Colorful 2" w:semiHidden="1" w:unhideWhenUsed="1"/>
+    <w:lsdException w:name="Table Colorful 3" w:semiHidden="1" w:unhideWhenUsed="1"/>
+    <w:lsdException w:name="Table Columns 1" w:semiHidden="1" w:unhideWhenUsed="1"/>
+    <w:lsdException w:name="Table Columns 2" w:semiHidden="1" w:unhideWhenUsed="1"/>
+    <w:lsdException w:name="Table Columns 3" w:semiHidden="1" w:unhideWhenUsed="1"/>
+    <w:lsdException w:name="Table Columns 4" w:semiHidden="1" w:unhideWhenUsed="1"/>
+    <w:lsdException w:name="Table Columns 5" w:semiHidden="1" w:unhideWhenUsed="1"/>
+    <w:lsdException w:name="Table Grid 1" w:semiHidden="1" w:unhideWhenUsed="1"/>
+    <w:lsdException w:name="Table Grid 2" w:semiHidden="1" w:unhideWhenUsed="1"/>
+    <w:lsdException w:name="Table Grid 3" w:semiHidden="1" w:unhideWhenUsed="1"/>
+    <w:lsdException w:name="Table Grid 4" w:semiHidden="1" w:unhideWhenUsed="1"/>
+    <w:lsdException w:name="Table Grid 5" w:semiHidden="1" w:unhideWhenUsed="1"/>
+    <w:lsdException w:name="Table Grid 6" w:semiHidden="1" w:unhideWhenUsed="1"/>
+    <w:lsdException w:name="Table Grid 7" w:semiHidden="1" w:unhideWhenUsed="1"/>
+    <w:lsdException w:name="Table Grid 8" w:semiHidden="1" w:unhideWhenUsed="1"/>
+    <w:lsdException w:name="Table List 1" w:semiHidden="1" w:unhideWhenUsed="1"/>
+    <w:lsdException w:name="Table List 2" w:semiHidden="1" w:unhideWhenUsed="1"/>
+    <w:lsdException w:name="Table List 3" w:semiHidden="1" w:unhideWhenUsed="1"/>
+    <w:lsdException w:name="Table List 4" w:semiHidden="1" w:unhideWhenUsed="1"/>
+    <w:lsdException w:name="Table List 5" w:semiHidden="1" w:unhideWhenUsed="1"/>
+    <w:lsdException w:name="Table List 6" w:semiHidden="1" w:unhideWhenUsed="1"/>
+    <w:lsdException w:name="Table List 7" w:semiHidden="1" w:unhideWhenUsed="1"/>
+    <w:lsdException w:name="Table List 8" w:semiHidden="1" w:unhideWhenUsed="1"/>
+    <w:lsdException w:name="Table 3D effects 1" w:semiHidden="1" w:unhideWhenUsed="1"/>
+    <w:lsdException w:name="Table 3D effects 2" w:semiHidden="1" w:unhideWhenUsed="1"/>
+    <w:lsdException w:name="Table 3D effects 3" w:semiHidden="1" w:unhideWhenUsed="1"/>
+    <w:lsdException w:name="Table Contemporary" w:semiHidden="1" w:unhideWhenUsed="1"/>
+    <w:lsdException w:name="Table Elegant" w:semiHidden="1" w:unhideWhenUsed="1"/>
+    <w:lsdException w:name="Table Professional" w:semiHidden="1" w:unhideWhenUsed="1"/>
+    <w:lsdException w:name="Table Subtle 1" w:semiHidden="1" w:unhideWhenUsed="1"/>
+    <w:lsdException w:name="Table Subtle 2" w:semiHidden="1" w:unhideWhenUsed="1"/>
+    <w:lsdException w:name="Table Web 1" w:semiHidden="1" w:unhideWhenUsed="1"/>
+    <w:lsdException w:name="Table Web 2" w:semiHidden="1" w:unhideWhenUsed="1"/>
+    <w:lsdException w:name="Table Web 3" w:semiHidden="1" w:unhideWhenUsed="1"/>
+    <w:lsdException w:name="Balloon Text" w:semiHidden="1" w:unhideWhenUsed="1"/>
+    <w:lsdException w:name="Table Grid" w:uiPriority="39"/>
+    <w:lsdException w:name="Table Theme" w:semiHidden="1" w:unhideWhenUsed="1"/>
+    <w:lsdException w:name="Placeholder Text" w:semiHidden="1"/>
+    <w:lsdException w:name="No Spacing" w:uiPriority="1" w:qFormat="1"/>
+    <w:lsdException w:name="Light Shading" w:uiPriority="60"/>
+    <w:lsdException w:name="Light List" w:uiPriority="61"/>
+    <w:lsdException w:name="Light Grid" w:uiPriority="62"/>
+    <w:lsdException w:name="Medium Shading 1" w:uiPriority="63"/>
+    <w:lsdException w:name="Medium Shading 2" w:uiPriority="64"/>
+    <w:lsdException w:name="Medium List 1" w:uiPriority="65"/>
+    <w:lsdException w:name="Medium List 2" w:uiPriority="66"/>
+    <w:lsdException w:name="Medium Grid 1" w:uiPriority="67"/>
+    <w:lsdException w:name="Medium Grid 2" w:uiPriority="68"/>
+    <w:lsdException w:name="Medium Grid 3" w:uiPriority="69"/>
+    <w:lsdException w:name="Dark List" w:uiPriority="70"/>
+    <w:lsdException w:name="Colorful Shading" w:uiPriority="71"/>
+    <w:lsdException w:name="Colorful List" w:uiPriority="72"/>
+    <w:lsdException w:name="Colorful Grid" w:uiPriority="73"/>
+    <w:lsdException w:name="Light Shading Accent 1" w:uiPriority="60"/>
+    <w:lsdException w:name="Light List Accent 1" w:uiPriority="61"/>
+    <w:lsdException w:name="Light Grid Accent 1" w:uiPriority="62"/>
+    <w:lsdException w:name="Medium Shading 1 Accent 1" w:uiPriority="63"/>
+    <w:lsdException w:name="Medium Shading 2 Accent 1" w:uiPriority="64"/>
+    <w:lsdException w:name="Medium List 1 Accent 1" w:uiPriority="65"/>
+    <w:lsdException w:name="Revision" w:semiHidden="1"/>
+    <w:lsdException w:name="List Paragraph" w:uiPriority="34" w:qFormat="1"/>
+    <w:lsdException w:name="Quote" w:uiPriority="29" w:qFormat="1"/>
+    <w:lsdException w:name="Intense Quote" w:uiPriority="30" w:qFormat="1"/>
+    <w:lsdException w:name="Medium List 2 Accent 1" w:uiPriority="66"/>
+    <w:lsdException w:name="Medium Grid 1 Accent 1" w:uiPriority="67"/>
+    <w:lsdException w:name="Medium Grid 2 Accent 1" w:uiPriority="68"/>
+    <w:lsdException w:name="Medium Grid 3 Accent 1" w:uiPriority="69"/>
+    <w:lsdException w:name="Dark List Accent 1" w:uiPriority="70"/>
+    <w:lsdException w:name="Colorful Shading Accent 1" w:uiPriority="71"/>
+    <w:lsdException w:name="Colorful List Accent 1" w:uiPriority="72"/>
+    <w:lsdException w:name="Colorful Grid Accent 1" w:uiPriority="73"/>
+    <w:lsdException w:name="Light Shading Accent 2" w:uiPriority="60"/>
+    <w:lsdException w:name="Light List Accent 2" w:uiPriority="61"/>
+    <w:lsdException w:name="Light Grid Accent 2" w:uiPriority="62"/>
+    <w:lsdException w:name="Medium Shading 1 Accent 2" w:uiPriority="63"/>
+    <w:lsdException w:name="Medium Shading 2 Accent 2" w:uiPriority="64"/>
+    <w:lsdException w:name="Medium List 1 Accent 2" w:uiPriority="65"/>
+    <w:lsdException w:name="Medium List 2 Accent 2" w:uiPriority="66"/>
+    <w:lsdException w:name="Medium Grid 1 Accent 2" w:uiPriority="67"/>
+    <w:lsdException w:name="Medium Grid 2 Accent 2" w:uiPriority="68"/>
+    <w:lsdException w:name="Medium Grid 3 Accent 2" w:uiPriority="69"/>
+    <w:lsdException w:name="Dark List Accent 2" w:uiPriority="70"/>
+    <w:lsdException w:name="Colorful Shading Accent 2" w:uiPriority="71"/>
+    <w:lsdException w:name="Colorful List Accent 2" w:uiPriority="72"/>
+    <w:lsdException w:name="Colorful Grid Accent 2" w:uiPriority="73"/>
+    <w:lsdException w:name="Light Shading Accent 3" w:uiPriority="60"/>
+    <w:lsdException w:name="Light List Accent 3" w:uiPriority="61"/>
+    <w:lsdException w:name="Light Grid Accent 3" w:uiPriority="62"/>
+    <w:lsdException w:name="Medium Shading 1 Accent 3" w:uiPriority="63"/>
+    <w:lsdException w:name="Medium Shading 2 Accent 3" w:uiPriority="64"/>
+    <w:lsdException w:name="Medium List 1 Accent 3" w:uiPriority="65"/>
+    <w:lsdException w:name="Medium List 2 Accent 3" w:uiPriority="66"/>
+    <w:lsdException w:name="Medium Grid 1 Accent 3" w:uiPriority="67"/>
+    <w:lsdException w:name="Medium Grid 2 Accent 3" w:uiPriority="68"/>
+    <w:lsdException w:name="Medium Grid 3 Accent 3" w:uiPriority="69"/>
+    <w:lsdException w:name="Dark List Accent 3" w:uiPriority="70"/>
+    <w:lsdException w:name="Colorful Shading Accent 3" w:uiPriority="71"/>
+    <w:lsdException w:name="Colorful List Accent 3" w:uiPriority="72"/>
+    <w:lsdException w:name="Colorful Grid Accent 3" w:uiPriority="73"/>
+    <w:lsdException w:name="Light Shading Accent 4" w:uiPriority="60"/>
+    <w:lsdException w:name="Light List Accent 4" w:uiPriority="61"/>
+    <w:lsdException w:name="Light Grid Accent 4" w:uiPriority="62"/>
+    <w:lsdException w:name="Medium Shading 1 Accent 4" w:uiPriority="63"/>
+    <w:lsdException w:name="Medium Shading 2 Accent 4" w:uiPriority="64"/>
+    <w:lsdException w:name="Medium List 1 Accent 4" w:uiPriority="65"/>
+    <w:lsdException w:name="Medium List 2 Accent 4" w:uiPriority="66"/>
+    <w:lsdException w:name="Medium Grid 1 Accent 4" w:uiPriority="67"/>
+    <w:lsdException w:name="Medium Grid 2 Accent 4" w:uiPriority="68"/>
+    <w:lsdException w:name="Medium Grid 3 Accent 4" w:uiPriority="69"/>
+    <w:lsdException w:name="Dark List Accent 4" w:uiPriority="70"/>
+    <w:lsdException w:name="Colorful Shading Accent 4" w:uiPriority="71"/>
+    <w:lsdException w:name="Colorful List Accent 4" w:uiPriority="72"/>
+    <w:lsdException w:name="Colorful Grid Accent 4" w:uiPriority="73"/>
+    <w:lsdException w:name="Light Shading Accent 5" w:uiPriority="60"/>
+    <w:lsdException w:name="Light List Accent 5" w:uiPriority="61"/>
+    <w:lsdException w:name="Light Grid Accent 5" w:uiPriority="62"/>
+    <w:lsdException w:name="Medium Shading 1 Accent 5" w:uiPriority="63"/>
+    <w:lsdException w:name="Medium Shading 2 Accent 5" w:uiPriority="64"/>
+    <w:lsdException w:name="Medium List 1 Accent 5" w:uiPriority="65"/>
+    <w:lsdException w:name="Medium List 2 Accent 5" w:uiPriority="66"/>
+    <w:lsdException w:name="Medium Grid 1 Accent 5" w:uiPriority="67"/>
+    <w:lsdException w:name="Medium Grid 2 Accent 5" w:uiPriority="68"/>
+    <w:lsdException w:name="Medium Grid 3 Accent 5" w:uiPriority="69"/>
+    <w:lsdException w:name="Dark List Accent 5" w:uiPriority="70"/>
+    <w:lsdException w:name="Colorful Shading Accent 5" w:uiPriority="71"/>
+    <w:lsdException w:name="Colorful List Accent 5" w:uiPriority="72"/>
+    <w:lsdException w:name="Colorful Grid Accent 5" w:uiPriority="73"/>
+    <w:lsdException w:name="Light Shading Accent 6" w:uiPriority="60"/>
+    <w:lsdException w:name="Light List Accent 6" w:uiPriority="61"/>
+    <w:lsdException w:name="Light Grid Accent 6" w:uiPriority="62"/>
+    <w:lsdException w:name="Medium Shading 1 Accent 6" w:uiPriority="63"/>
+    <w:lsdException w:name="Medium Shading 2 Accent 6" w:uiPriority="64"/>
+    <w:lsdException w:name="Medium List 1 Accent 6" w:uiPriority="65"/>
+    <w:lsdException w:name="Medium List 2 Accent 6" w:uiPriority="66"/>
+    <w:lsdException w:name="Medium Grid 1 Accent 6" w:uiPriority="67"/>
+    <w:lsdException w:name="Medium Grid 2 Accent 6" w:uiPriority="68"/>
+    <w:lsdException w:name="Medium Grid 3 Accent 6" w:uiPriority="69"/>
+    <w:lsdException w:name="Dark List Accent 6" w:uiPriority="70"/>
+    <w:lsdException w:name="Colorful Shading Accent 6" w:uiPriority="71"/>
+    <w:lsdException w:name="Colorful List Accent 6" w:uiPriority="72"/>
+    <w:lsdException w:name="Colorful Grid Accent 6" w:uiPriority="73"/>
+    <w:lsdException w:name="Subtle Emphasis" w:uiPriority="19" w:qFormat="1"/>
+    <w:lsdException w:name="Intense Emphasis" w:uiPriority="21" w:qFormat="1"/>
+    <w:lsdException w:name="Subtle Reference" w:uiPriority="31" w:qFormat="1"/>
+    <w:lsdException w:name="Intense Reference" w:uiPriority="32" w:qFormat="1"/>
+    <w:lsdException w:name="Book Title" w:uiPriority="33" w:qFormat="1"/>
+    <w:lsdException w:name="Bibliography" w:semiHidden="1" w:uiPriority="37" w:unhideWhenUsed="1"/>
+    <w:lsdException w:name="TOC Heading" w:semiHidden="1" w:uiPriority="39" w:unhideWhenUsed="1" w:qFormat="1"/>
+    <w:lsdException w:name="Plain Table 1" w:uiPriority="41"/>
+    <w:lsdException w:name="Plain Table 2" w:uiPriority="42"/>
+    <w:lsdException w:name="Plain Table 3" w:uiPriority="43"/>
+    <w:lsdException w:name="Plain Table 4" w:uiPriority="44"/>
+    <w:lsdException w:name="Plain Table 5" w:uiPriority="45"/>
+    <w:lsdException w:name="Grid Table Light" w:uiPriority="40"/>
+    <w:lsdException w:name="Grid Table 1 Light" w:uiPriority="46"/>
+    <w:lsdException w:name="Grid Table 2" w:uiPriority="47"/>
+    <w:lsdException w:name="Grid Table 3" w:uiPriority="48"/>
+    <w:lsdException w:name="Grid Table 4" w:uiPriority="49"/>
+    <w:lsdException w:name="Grid Table 5 Dark" w:uiPriority="50"/>
+    <w:lsdException w:name="Grid Table 6 Colorful" w:uiPriority="51"/>
+    <w:lsdException w:name="Grid Table 7 Colorful" w:uiPriority="52"/>
+    <w:lsdException w:name="Grid Table 1 Light Accent 1" w:uiPriority="46"/>
+    <w:lsdException w:name="Grid Table 2 Accent 1" w:uiPriority="47"/>
+    <w:lsdException w:name="Grid Table 3 Accent 1" w:uiPriority="48"/>
+    <w:lsdException w:name="Grid Table 4 Accent 1" w:uiPriority="49"/>
+    <w:lsdException w:name="Grid Table 5 Dark Accent 1" w:uiPriority="50"/>
+    <w:lsdException w:name="Grid Table 6 Colorful Accent 1" w:uiPriority="51"/>
+    <w:lsdException w:name="Grid Table 7 Colorful Accent 1" w:uiPriority="52"/>
+    <w:lsdException w:name="Grid Table 1 Light Accent 2" w:uiPriority="46"/>
+    <w:lsdException w:name="Grid Table 2 Accent 2" w:uiPriority="47"/>
+    <w:lsdException w:name="Grid Table 3 Accent 2" w:uiPriority="48"/>
+    <w:lsdException w:name="Grid Table 4 Accent 2" w:uiPriority="49"/>
+    <w:lsdException w:name="Grid Table 5 Dark Accent 2" w:uiPriority="50"/>
+    <w:lsdException w:name="Grid Table 6 Colorful Accent 2" w:uiPriority="51"/>
+    <w:lsdException w:name="Grid Table 7 Colorful Accent 2" w:uiPriority="52"/>
+    <w:lsdException w:name="Grid Table 1 Light Accent 3" w:uiPriority="46"/>
+    <w:lsdException w:name="Grid Table 2 Accent 3" w:uiPriority="47"/>
+    <w:lsdException w:name="Grid Table 3 Accent 3" w:uiPriority="48"/>
+    <w:lsdException w:name="Grid Table 4 Accent 3" w:uiPriority="49"/>
+    <w:lsdException w:name="Grid Table 5 Dark Accent 3" w:uiPriority="50"/>
+    <w:lsdException w:name="Grid Table 6 Colorful Accent 3" w:uiPriority="51"/>
+    <w:lsdException w:name="Grid Table 7 Colorful Accent 3" w:uiPriority="52"/>
+    <w:lsdException w:name="Grid Table 1 Light Accent 4" w:uiPriority="46"/>
+    <w:lsdException w:name="Grid Table 2 Accent 4" w:uiPriority="47"/>
+    <w:lsdException w:name="Grid Table 3 Accent 4" w:uiPriority="48"/>
+    <w:lsdException w:name="Grid Table 4 Accent 4" w:uiPriority="49"/>
+    <w:lsdException w:name="Grid Table 5 Dark Accent 4" w:uiPriority="50"/>
+    <w:lsdException w:name="Grid Table 6 Colorful Accent 4" w:uiPriority="51"/>
+    <w:lsdException w:name="Grid Table 7 Colorful Accent 4" w:uiPriority="52"/>
+    <w:lsdException w:name="Grid Table 1 Light Accent 5" w:uiPriority="46"/>
+    <w:lsdException w:name="Grid Table 2 Accent 5" w:uiPriority="47"/>
+    <w:lsdException w:name="Grid Table 3 Accent 5" w:uiPriority="48"/>
+    <w:lsdException w:name="Grid Table 4 Accent 5" w:uiPriority="49"/>
+    <w:lsdException w:name="Grid Table 5 Dark Accent 5" w:uiPriority="50"/>
+    <w:lsdException w:name="Grid Table 6 Colorful Accent 5" w:uiPriority="51"/>
+    <w:lsdException w:name="Grid Table 7 Colorful Accent 5" w:uiPriority="52"/>
+    <w:lsdException w:name="Grid Table 1 Light Accent 6" w:uiPriority="46"/>
+    <w:lsdException w:name="Grid Table 2 Accent 6" w:uiPriority="47"/>
+    <w:lsdException w:name="Grid Table 3 Accent 6" w:uiPriority="48"/>
+    <w:lsdException w:name="Grid Table 4 Accent 6" w:uiPriority="49"/>
+    <w:lsdException w:name="Grid Table 5 Dark Accent 6" w:uiPriority="50"/>
+    <w:lsdException w:name="Grid Table 6 Colorful Accent 6" w:uiPriority="51"/>
+    <w:lsdException w:name="Grid Table 7 Colorful Accent 6" w:uiPriority="52"/>
+    <w:lsdException w:name="List Table 1 Light" w:uiPriority="46"/>
+    <w:lsdException w:name="List Table 2" w:uiPriority="47"/>
+    <w:lsdException w:name="List Table 3" w:uiPriority="48"/>
+    <w:lsdException w:name="List Table 4" w:uiPriority="49"/>
+    <w:lsdException w:name="List Table 5 Dark" w:uiPriority="50"/>
+    <w:lsdException w:name="List Table 6 Colorful" w:uiPriority="51"/>
+    <w:lsdException w:name="List Table 7 Colorful" w:uiPriority="52"/>
+    <w:lsdException w:name="List Table 1 Light Accent 1" w:uiPriority="46"/>
+    <w:lsdException w:name="List Table 2 Accent 1" w:uiPriority="47"/>
+    <w:lsdException w:name="List Table 3 Accent 1" w:uiPriority="48"/>
+    <w:lsdException w:name="List Table 4 Accent 1" w:uiPriority="49"/>
+    <w:lsdException w:name="List Table 5 Dark Accent 1" w:uiPriority="50"/>
+    <w:lsdException w:name="List Table 6 Colorful Accent 1" w:uiPriority="51"/>
+    <w:lsdException w:name="List Table 7 Colorful Accent 1" w:uiPriority="52"/>
+    <w:lsdException w:name="List Table 1 Light Accent 2" w:uiPriority="46"/>
+    <w:lsdException w:name="List Table 2 Accent 2" w:uiPriority="47"/>
+    <w:lsdException w:name="List Table 3 Accent 2" w:uiPriority="48"/>
+    <w:lsdException w:name="List Table 4 Accent 2" w:uiPriority="49"/>
+    <w:lsdException w:name="List Table 5 Dark Accent 2" w:uiPriority="50"/>
+    <w:lsdException w:name="List Table 6 Colorful Accent 2" w:uiPriority="51"/>
+    <w:lsdException w:name="List Table 7 Colorful Accent 2" w:uiPriority="52"/>
+    <w:lsdException w:name="List Table 1 Light Accent 3" w:uiPriority="46"/>
+    <w:lsdException w:name="List Table 2 Accent 3" w:uiPriority="47"/>
+    <w:lsdException w:name="List Table 3 Accent 3" w:uiPriority="48"/>
+    <w:lsdException w:name="List Table 4 Accent 3" w:uiPriority="49"/>
+    <w:lsdException w:name="List Table 5 Dark Accent 3" w:uiPriority="50"/>
+    <w:lsdException w:name="List Table 6 Colorful Accent 3" w:uiPriority="51"/>
+    <w:lsdException w:name="List Table 7 Colorful Accent 3" w:uiPriority="52"/>
+    <w:lsdException w:name="List Table 1 Light Accent 4" w:uiPriority="46"/>
+    <w:lsdException w:name="List Table 2 Accent 4" w:uiPriority="47"/>
+    <w:lsdException w:name="List Table 3 Accent 4" w:uiPriority="48"/>
+    <w:lsdException w:name="List Table 4 Accent 4" w:uiPriority="49"/>
+    <w:lsdException w:name="List Table 5 Dark Accent 4" w:uiPriority="50"/>
+    <w:lsdException w:name="List Table 6 Colorful Accent 4" w:uiPriority="51"/>
+    <w:lsdException w:name="List Table 7 Colorful Accent 4" w:uiPriority="52"/>
+    <w:lsdException w:name="List Table 1 Light Accent 5" w:uiPriority="46"/>
+    <w:lsdException w:name="List Table 2 Accent 5" w:uiPriority="47"/>
+    <w:lsdException w:name="List Table 3 Accent 5" w:uiPriority="48"/>
+    <w:lsdException w:name="List Table 4 Accent 5" w:uiPriority="49"/>
+    <w:lsdException w:name="List Table 5 Dark Accent 5" w:uiPriority="50"/>
+    <w:lsdException w:name="List Table 6 Colorful Accent 5" w:uiPriority="51"/>
+    <w:lsdException w:name="List Table 7 Colorful Accent 5" w:uiPriority="52"/>
+    <w:lsdException w:name="List Table 1 Light Accent 6" w:uiPriority="46"/>
+    <w:lsdException w:name="List Table 2 Accent 6" w:uiPriority="47"/>
+    <w:lsdException w:name="List Table 3 Accent 6" w:uiPriority="48"/>
+    <w:lsdException w:name="List Table 4 Accent 6" w:uiPriority="49"/>
+    <w:lsdException w:name="List Table 5 Dark Accent 6" w:uiPriority="50"/>
+    <w:lsdException w:name="List Table 6 Colorful Accent 6" w:uiPriority="51"/>
+    <w:lsdException w:name="List Table 7 Colorful Accent 6" w:uiPriority="52"/>
+    <w:lsdException w:name="Mention" w:semiHidden="1" w:unhideWhenUsed="1"/>
+    <w:lsdException w:name="Smart Hyperlink" w:semiHidden="1" w:unhideWhenUsed="1"/>
+    <w:lsdException w:name="Hashtag" w:semiHidden="1" w:unhideWhenUsed="1"/>
+    <w:lsdException w:name="Unresolved Mention" w:semiHidden="1" w:unhideWhenUsed="1"/>
+    <w:lsdException w:name="Smart Link" w:semiHidden="1" w:unhideWhenUsed="1"/>
+  </w:latentStyles>
+  <w:style w:type="paragraph" w:default="1" w:styleId="Normal">
+    <w:name w:val="Normal"/>
+    <w:qFormat/>
   </w:style>
   <w:style w:type="paragraph" w:styleId="Heading1">
     <w:name w:val="heading 1"/>
-    <w:basedOn w:val="Normal"/>
-    <w:next w:val="Normal"/>
     <w:uiPriority w:val="9"/>
     <w:qFormat/>
     <w:pPr>
@@ -2198,8 +2573,6 @@
   </w:style>
   <w:style w:type="paragraph" w:styleId="Heading2">
     <w:name w:val="heading 2"/>
-    <w:basedOn w:val="Normal"/>
-    <w:next w:val="Normal"/>
     <w:uiPriority w:val="9"/>
     <w:unhideWhenUsed/>
     <w:qFormat/>
@@ -2217,10 +2590,7 @@
   </w:style>
   <w:style w:type="paragraph" w:styleId="Heading3">
     <w:name w:val="heading 3"/>
-    <w:basedOn w:val="Normal"/>
-    <w:next w:val="Normal"/>
     <w:uiPriority w:val="9"/>
-    <w:semiHidden/>
     <w:unhideWhenUsed/>
     <w:qFormat/>
     <w:pPr>
@@ -2237,8 +2607,6 @@
   </w:style>
   <w:style w:type="paragraph" w:styleId="Heading4">
     <w:name w:val="heading 4"/>
-    <w:basedOn w:val="Normal"/>
-    <w:next w:val="Normal"/>
     <w:uiPriority w:val="9"/>
     <w:semiHidden/>
     <w:unhideWhenUsed/>
@@ -2257,8 +2625,6 @@
   </w:style>
   <w:style w:type="paragraph" w:styleId="Heading5">
     <w:name w:val="heading 5"/>
-    <w:basedOn w:val="Normal"/>
-    <w:next w:val="Normal"/>
     <w:uiPriority w:val="9"/>
     <w:semiHidden/>
     <w:unhideWhenUsed/>
@@ -2275,8 +2641,6 @@
   </w:style>
   <w:style w:type="paragraph" w:styleId="Heading6">
     <w:name w:val="heading 6"/>
-    <w:basedOn w:val="Normal"/>
-    <w:next w:val="Normal"/>
     <w:uiPriority w:val="9"/>
     <w:semiHidden/>
     <w:unhideWhenUsed/>
@@ -2291,6 +2655,40 @@
       <w:b/>
       <w:sz w:val="20"/>
       <w:szCs w:val="20"/>
+    </w:rPr>
+  </w:style>
+  <w:style w:type="character" w:default="1" w:styleId="DefaultParagraphFont">
+    <w:name w:val="Default Paragraph Font"/>
+    <w:uiPriority w:val="1"/>
+    <w:semiHidden/>
+    <w:unhideWhenUsed/>
+  </w:style>
+  <w:style w:type="table" w:default="1" w:styleId="TableNormal">
+    <w:name w:val="Normal Table"/>
+    <w:uiPriority w:val="99"/>
+    <w:semiHidden/>
+    <w:unhideWhenUsed/>
+    <w:tblPr>
+      <w:tblInd w:w="0" w:type="dxa"/>
+      <w:tblCellMar>
+        <w:top w:w="0" w:type="dxa"/>
+        <w:left w:w="108" w:type="dxa"/>
+        <w:bottom w:w="0" w:type="dxa"/>
+        <w:right w:w="108" w:type="dxa"/>
+      </w:tblCellMar>
+    </w:tblPr>
+  </w:style>
+  <w:style w:type="numbering" w:default="1" w:styleId="NoList">
+    <w:name w:val="No List"/>
+    <w:uiPriority w:val="99"/>
+    <w:semiHidden/>
+    <w:unhideWhenUsed/>
+  </w:style>
+  <w:style w:type="character" w:styleId="Hyperlink">
+    <w:name w:val="Hyperlink"/>
+    <w:rPr>
+      <w:color w:val="0000FF"/>
+      <w:u w:val="single"/>
     </w:rPr>
   </w:style>
 </w:styles>
@@ -2487,5 +2885,7 @@
       </a:bgFillStyleLst>
     </a:fmtScheme>
   </a:themeElements>
+  <a:objectDefaults/>
+  <a:extraClrSchemeLst/>
 </a:theme>
 </file>
</xml_diff>